<commit_message>
update to diagrams, specifically class diagram
</commit_message>
<xml_diff>
--- a/docs/TL3_Kaleb/Champion_Upgrade_and_Loot_System.docx
+++ b/docs/TL3_Kaleb/Champion_Upgrade_and_Loot_System.docx
@@ -4532,6 +4532,46 @@
         </w:rPr>
         <w:lastRenderedPageBreak/>
         <w:drawing>
+          <wp:inline distT="0" distB="0" distL="0" distR="0" wp14:anchorId="4A298985" wp14:editId="6E8200A4">
+            <wp:extent cx="6172200" cy="4316095"/>
+            <wp:effectExtent l="0" t="0" r="0" b="1905"/>
+            <wp:docPr id="1068752894" name="Picture 1"/>
+            <wp:cNvGraphicFramePr>
+              <a:graphicFrameLocks xmlns:a="http://schemas.openxmlformats.org/drawingml/2006/main" noChangeAspect="1"/>
+            </wp:cNvGraphicFramePr>
+            <a:graphic xmlns:a="http://schemas.openxmlformats.org/drawingml/2006/main">
+              <a:graphicData uri="http://schemas.openxmlformats.org/drawingml/2006/picture">
+                <pic:pic xmlns:pic="http://schemas.openxmlformats.org/drawingml/2006/picture">
+                  <pic:nvPicPr>
+                    <pic:cNvPr id="1068752894" name="Picture 1068752894"/>
+                    <pic:cNvPicPr/>
+                  </pic:nvPicPr>
+                  <pic:blipFill>
+                    <a:blip r:embed="rId8"/>
+                    <a:stretch>
+                      <a:fillRect/>
+                    </a:stretch>
+                  </pic:blipFill>
+                  <pic:spPr>
+                    <a:xfrm>
+                      <a:off x="0" y="0"/>
+                      <a:ext cx="6172200" cy="4316095"/>
+                    </a:xfrm>
+                    <a:prstGeom prst="rect">
+                      <a:avLst/>
+                    </a:prstGeom>
+                  </pic:spPr>
+                </pic:pic>
+              </a:graphicData>
+            </a:graphic>
+          </wp:inline>
+        </w:drawing>
+      </w:r>
+      <w:r>
+        <w:rPr>
+          <w:noProof/>
+        </w:rPr>
+        <w:drawing>
           <wp:inline distT="0" distB="0" distL="0" distR="0" wp14:anchorId="33B45208" wp14:editId="27BBD4CD">
             <wp:extent cx="6217920" cy="3503165"/>
             <wp:effectExtent l="0" t="0" r="0" b="0"/>
@@ -4547,7 +4587,7 @@
                     <pic:cNvPicPr/>
                   </pic:nvPicPr>
                   <pic:blipFill>
-                    <a:blip r:embed="rId8"/>
+                    <a:blip r:embed="rId9"/>
                     <a:stretch>
                       <a:fillRect/>
                     </a:stretch>
@@ -4577,6 +4617,7 @@
         <w:rPr>
           <w:noProof/>
         </w:rPr>
+        <w:lastRenderedPageBreak/>
         <w:drawing>
           <wp:inline distT="0" distB="0" distL="0" distR="0" wp14:anchorId="6BDF726B" wp14:editId="76356AAE">
             <wp:extent cx="6217920" cy="3482363"/>
@@ -4593,7 +4634,7 @@
                     <pic:cNvPicPr/>
                   </pic:nvPicPr>
                   <pic:blipFill>
-                    <a:blip r:embed="rId9"/>
+                    <a:blip r:embed="rId10"/>
                     <a:stretch>
                       <a:fillRect/>
                     </a:stretch>
@@ -4637,7 +4678,6 @@
         <w:rPr>
           <w:noProof/>
         </w:rPr>
-        <w:lastRenderedPageBreak/>
         <w:drawing>
           <wp:inline distT="0" distB="0" distL="0" distR="0" wp14:anchorId="7A4A8021" wp14:editId="172279FC">
             <wp:extent cx="5943600" cy="3463431"/>
@@ -4654,7 +4694,7 @@
                     <pic:cNvPicPr/>
                   </pic:nvPicPr>
                   <pic:blipFill>
-                    <a:blip r:embed="rId10"/>
+                    <a:blip r:embed="rId11"/>
                     <a:stretch>
                       <a:fillRect/>
                     </a:stretch>
@@ -4697,6 +4737,7 @@
           <w:color w:val="1E2761"/>
           <w:sz w:val="30"/>
         </w:rPr>
+        <w:lastRenderedPageBreak/>
         <w:t>5.  Timeline (Feature 4 only)</w:t>
       </w:r>
     </w:p>
@@ -5447,7 +5488,6 @@
                 <w:rFonts w:eastAsia="Calibri"/>
                 <w:sz w:val="20"/>
               </w:rPr>
-              <w:lastRenderedPageBreak/>
               <w:t>9.  Unit tests (deltas, drops, restore)</w:t>
             </w:r>
           </w:p>
@@ -5617,7 +5657,7 @@
                     <pic:cNvPicPr/>
                   </pic:nvPicPr>
                   <pic:blipFill>
-                    <a:blip r:embed="rId11"/>
+                    <a:blip r:embed="rId12"/>
                     <a:stretch>
                       <a:fillRect/>
                     </a:stretch>
@@ -5646,6 +5686,7 @@
         <w:rPr>
           <w:rFonts w:eastAsia="Calibri"/>
         </w:rPr>
+        <w:lastRenderedPageBreak/>
         <w:t>PERT nodes are the Feature 4 tasks in the table, not Diagram 0’s feature numbers. The critical path is 1 → 3 → 4 → 7 → 8 → 9 (equivalently 1 → 3 → 5 → 7 → 8 → 9), totaling 31 hours of my calendar time. Tasks 4 and 5 are both critical because either one finishing late delays ApplyItem. Task 2 carries 10 hours of slack; task 6 carries 6; documentation (task 10) carries 5. Design of the loot tables can slip without moving my finish, but the Item hierarchy cannot.</w:t>
       </w:r>
     </w:p>
@@ -5672,7 +5713,6 @@
         <w:rPr>
           <w:noProof/>
         </w:rPr>
-        <w:lastRenderedPageBreak/>
         <w:drawing>
           <wp:inline distT="0" distB="0" distL="0" distR="0" wp14:anchorId="62B9BD89" wp14:editId="0AA90E49">
             <wp:extent cx="5943600" cy="3218471"/>
@@ -5689,7 +5729,7 @@
                     <pic:cNvPicPr/>
                   </pic:nvPicPr>
                   <pic:blipFill>
-                    <a:blip r:embed="rId12"/>
+                    <a:blip r:embed="rId13"/>
                     <a:stretch>
                       <a:fillRect/>
                     </a:stretch>
@@ -5765,7 +5805,14 @@
         <w:rPr>
           <w:rFonts w:eastAsia="Calibri"/>
         </w:rPr>
-        <w:t>Later passes corrected diagrams against instructor examples. Use-case lines follow the Pearson legend: Communicates is a solid line with no heads; &lt;&lt; include &gt;&gt; and &lt;&lt; extend &gt;&gt; are dashed with a filled head (include points at the common use case; extend points from the exception to the basic use case). Diagram 0 has one process per spec feature (1–7) with process 4 highlighted; stores D1–D5 are the open-right Gane–Sarson symbol (ID band on the left). Every flow starts and ends on a box — dead-end arrows on Diagram 0 and Diagram 4 were rejected. Diagram 4 explodes process 4 (4.1 Roll Drop, 4.2 Apply Effect, 4.3 Revert, 4.4 Snapshot). PERT node numbers are Feature 4 work items, not Diagram 0 feature IDs; the Gantt axis is Feature 4 hour.</w:t>
+        <w:t xml:space="preserve">Later passes corrected diagrams against instructor examples. Use-case lines follow the Pearson legend: Communicates is a solid line with no heads; &lt;&lt; include &gt;&gt; and &lt;&lt; extend &gt;&gt; are dashed with a filled head </w:t>
+      </w:r>
+      <w:r>
+        <w:rPr>
+          <w:rFonts w:eastAsia="Calibri"/>
+        </w:rPr>
+        <w:lastRenderedPageBreak/>
+        <w:t>(include points at the common use case; extend points from the exception to the basic use case). Diagram 0 has one process per spec feature (1–7) with process 4 highlighted; stores D1–D5 are the open-right Gane–Sarson symbol (ID band on the left). Every flow starts and ends on a box — dead-end arrows on Diagram 0 and Diagram 4 were rejected. Diagram 4 explodes process 4 (4.1 Roll Drop, 4.2 Apply Effect, 4.3 Revert, 4.4 Snapshot). PERT node numbers are Feature 4 work items, not Diagram 0 feature IDs; the Gantt axis is Feature 4 hour.</w:t>
       </w:r>
     </w:p>
     <w:sectPr>

</xml_diff>